<commit_message>
muda da data de entrega
</commit_message>
<xml_diff>
--- a/Projecto final/Projecto Criação de uma API ou varias API’s consumidas por Website  Aplicação Móvel.docx
+++ b/Projecto final/Projecto Criação de uma API ou varias API’s consumidas por Website  Aplicação Móvel.docx
@@ -710,7 +710,13 @@
         <w:t xml:space="preserve"> )</w:t>
       </w:r>
     </w:p>
-    <w:p/>
+    <w:p>
+      <w:pPr>
+        <w:rPr>
+          <w:lang w:val="en-GB"/>
+        </w:rPr>
+      </w:pPr>
+    </w:p>
     <w:p>
       <w:pPr>
         <w:rPr>
@@ -1440,7 +1446,37 @@
           <w:b/>
           <w:bCs/>
         </w:rPr>
-        <w:t>12 de dezembro de 2025</w:t>
+        <w:t xml:space="preserve">6 </w:t>
+      </w:r>
+      <w:r>
+        <w:rPr>
+          <w:b/>
+          <w:bCs/>
+        </w:rPr>
+        <w:t xml:space="preserve">de </w:t>
+      </w:r>
+      <w:proofErr w:type="gramStart"/>
+      <w:r>
+        <w:rPr>
+          <w:b/>
+          <w:bCs/>
+        </w:rPr>
+        <w:t>Maio</w:t>
+      </w:r>
+      <w:proofErr w:type="gramEnd"/>
+      <w:r>
+        <w:rPr>
+          <w:b/>
+          <w:bCs/>
+        </w:rPr>
+        <w:t xml:space="preserve"> de 202</w:t>
+      </w:r>
+      <w:r>
+        <w:rPr>
+          <w:b/>
+          <w:bCs/>
+        </w:rPr>
+        <w:t>6</w:t>
       </w:r>
     </w:p>
     <w:p>
@@ -1465,10 +1501,43 @@
           <w:b/>
           <w:bCs/>
         </w:rPr>
-        <w:t>12 de dezembro de 2025</w:t>
-      </w:r>
-      <w:r>
-        <w:t xml:space="preserve"> (no mesmo dia da entrega)</w:t>
+        <w:t xml:space="preserve">6 </w:t>
+      </w:r>
+      <w:r>
+        <w:rPr>
+          <w:b/>
+          <w:bCs/>
+        </w:rPr>
+        <w:t xml:space="preserve">de </w:t>
+      </w:r>
+      <w:proofErr w:type="gramStart"/>
+      <w:r>
+        <w:rPr>
+          <w:b/>
+          <w:bCs/>
+        </w:rPr>
+        <w:t>Maio</w:t>
+      </w:r>
+      <w:proofErr w:type="gramEnd"/>
+      <w:r>
+        <w:rPr>
+          <w:b/>
+          <w:bCs/>
+        </w:rPr>
+        <w:t xml:space="preserve"> de 202</w:t>
+      </w:r>
+      <w:r>
+        <w:rPr>
+          <w:b/>
+          <w:bCs/>
+        </w:rPr>
+        <w:t>6</w:t>
+      </w:r>
+      <w:r>
+        <w:t xml:space="preserve"> </w:t>
+      </w:r>
+      <w:r>
+        <w:t>(no mesmo dia da entrega)</w:t>
       </w:r>
     </w:p>
     <w:p/>

</xml_diff>